<commit_message>
Updated branching and story
</commit_message>
<xml_diff>
--- a/The_Sun.docx
+++ b/The_Sun.docx
@@ -509,25 +509,61 @@
           <w:szCs w:val="26"/>
           <w:rtl w:val="0"/>
         </w:rPr>
-        <w:t xml:space="preserve">NARRATOR: Though, she still can't see anything through the amber light. It only glows on the walls, a bit of her skin. She doesn't even recoil at the sight of her sunken sight of it anymore. It's withered like a plum. Dry like tree bark with striations that look just the same.</w:t>
-      </w:r>
-    </w:p>
-    <w:p>
-      <w:pPr>
-        <w:rPr>
-          <w:rFonts w:ascii="Times New Roman" w:cs="Times New Roman" w:eastAsia="Times New Roman" w:hAnsi="Times New Roman"/>
-          <w:sz w:val="26"/>
-          <w:szCs w:val="26"/>
-        </w:rPr>
-      </w:pPr>
-      <w:r>
-        <w:rPr>
-          <w:rFonts w:ascii="Times New Roman" w:cs="Times New Roman" w:eastAsia="Times New Roman" w:hAnsi="Times New Roman"/>
-          <w:sz w:val="26"/>
-          <w:szCs w:val="26"/>
-          <w:rtl w:val="0"/>
-        </w:rPr>
-        <w:t xml:space="preserve">NARRATOR: For the past few days she's been looking for food. It's weird not having water, but what can you do? It's been five years since the end.</w:t>
+        <w:t xml:space="preserve">NARRATOR: Though, she still can't see anything through the amber light. </w:t>
+      </w:r>
+    </w:p>
+    <w:p>
+      <w:pPr>
+        <w:rPr>
+          <w:rFonts w:ascii="Times New Roman" w:cs="Times New Roman" w:eastAsia="Times New Roman" w:hAnsi="Times New Roman"/>
+          <w:sz w:val="26"/>
+          <w:szCs w:val="26"/>
+        </w:rPr>
+      </w:pPr>
+      <w:r>
+        <w:rPr>
+          <w:rFonts w:ascii="Times New Roman" w:cs="Times New Roman" w:eastAsia="Times New Roman" w:hAnsi="Times New Roman"/>
+          <w:sz w:val="26"/>
+          <w:szCs w:val="26"/>
+          <w:rtl w:val="0"/>
+        </w:rPr>
+        <w:t xml:space="preserve">NARRATOR: It glows only on the walls and a small portion of her own skin, which is withered and coarse like tree bark.</w:t>
+      </w:r>
+    </w:p>
+    <w:p>
+      <w:pPr>
+        <w:rPr>
+          <w:rFonts w:ascii="Times New Roman" w:cs="Times New Roman" w:eastAsia="Times New Roman" w:hAnsi="Times New Roman"/>
+          <w:sz w:val="26"/>
+          <w:szCs w:val="26"/>
+        </w:rPr>
+      </w:pPr>
+      <w:r>
+        <w:rPr>
+          <w:rFonts w:ascii="Times New Roman" w:cs="Times New Roman" w:eastAsia="Times New Roman" w:hAnsi="Times New Roman"/>
+          <w:sz w:val="26"/>
+          <w:szCs w:val="26"/>
+          <w:rtl w:val="0"/>
+        </w:rPr>
+        <w:t xml:space="preserve">NARRATOR: Es feels around the hedges of the walls, peppered in holes large enough for a finger to fit through. The roughness of the concrete is cold, but inside the holes is colder. Some are larger than others.</w:t>
+      </w:r>
+    </w:p>
+    <w:p>
+      <w:pPr>
+        <w:rPr>
+          <w:rFonts w:ascii="Times New Roman" w:cs="Times New Roman" w:eastAsia="Times New Roman" w:hAnsi="Times New Roman"/>
+          <w:sz w:val="26"/>
+          <w:szCs w:val="26"/>
+        </w:rPr>
+      </w:pPr>
+      <w:r>
+        <w:rPr>
+          <w:rFonts w:ascii="Times New Roman" w:cs="Times New Roman" w:eastAsia="Times New Roman" w:hAnsi="Times New Roman"/>
+          <w:sz w:val="26"/>
+          <w:szCs w:val="26"/>
+          <w:rtl w:val="0"/>
+        </w:rPr>
+        <w:t xml:space="preserve">NARRATOR: She sticks her finger into one of them. Then another. Another. </w:t>
       </w:r>
     </w:p>
     <w:p>
@@ -563,7 +599,7 @@
           <w:szCs w:val="26"/>
           <w:rtl w:val="0"/>
         </w:rPr>
-        <w:t xml:space="preserve">NARRATOR: She scratches the wall and finds holes. Long, deep ones her index can stretch in and wiggle around and feel the roughness of the concrete foundation. It's cold in all of them.</w:t>
+        <w:t xml:space="preserve">NARRATOR: Until she nabs something in one of the holes and squishes it beneath her fingertip.</w:t>
       </w:r>
     </w:p>
     <w:p>
@@ -599,61 +635,61 @@
           <w:szCs w:val="26"/>
           <w:rtl w:val="0"/>
         </w:rPr>
-        <w:t xml:space="preserve">NARRATOR: She nabs something squishy in the crevice and rolls it beneath her fingertip. It squashes down and no moisture comes out. And it stays squashed.</w:t>
-      </w:r>
-    </w:p>
-    <w:p>
-      <w:pPr>
-        <w:rPr>
-          <w:rFonts w:ascii="Times New Roman" w:cs="Times New Roman" w:eastAsia="Times New Roman" w:hAnsi="Times New Roman"/>
-          <w:sz w:val="26"/>
-          <w:szCs w:val="26"/>
-        </w:rPr>
-      </w:pPr>
-      <w:r>
-        <w:rPr>
-          <w:rFonts w:ascii="Times New Roman" w:cs="Times New Roman" w:eastAsia="Times New Roman" w:hAnsi="Times New Roman"/>
-          <w:sz w:val="26"/>
-          <w:szCs w:val="26"/>
-          <w:rtl w:val="0"/>
-        </w:rPr>
-        <w:t xml:space="preserve">ES: "Feels like corn."</w:t>
-      </w:r>
-    </w:p>
-    <w:p>
-      <w:pPr>
-        <w:rPr>
-          <w:rFonts w:ascii="Times New Roman" w:cs="Times New Roman" w:eastAsia="Times New Roman" w:hAnsi="Times New Roman"/>
-          <w:sz w:val="26"/>
-          <w:szCs w:val="26"/>
-        </w:rPr>
-      </w:pPr>
-      <w:r>
-        <w:rPr>
-          <w:rFonts w:ascii="Times New Roman" w:cs="Times New Roman" w:eastAsia="Times New Roman" w:hAnsi="Times New Roman"/>
-          <w:sz w:val="26"/>
-          <w:szCs w:val="26"/>
-          <w:rtl w:val="0"/>
-        </w:rPr>
-        <w:t xml:space="preserve">NARRATOR: Though, she can barely remember what corn kernels even felt like back in the day.</w:t>
-      </w:r>
-    </w:p>
-    <w:p>
-      <w:pPr>
-        <w:rPr>
-          <w:rFonts w:ascii="Times New Roman" w:cs="Times New Roman" w:eastAsia="Times New Roman" w:hAnsi="Times New Roman"/>
-          <w:sz w:val="26"/>
-          <w:szCs w:val="26"/>
-        </w:rPr>
-      </w:pPr>
-      <w:r>
-        <w:rPr>
-          <w:rFonts w:ascii="Times New Roman" w:cs="Times New Roman" w:eastAsia="Times New Roman" w:hAnsi="Times New Roman"/>
-          <w:sz w:val="26"/>
-          <w:szCs w:val="26"/>
-          <w:rtl w:val="0"/>
-        </w:rPr>
-        <w:t xml:space="preserve">NARRATOR: She slides it out and squints in the dark.</w:t>
+        <w:t xml:space="preserve">ES: "Got’ya"</w:t>
+      </w:r>
+    </w:p>
+    <w:p>
+      <w:pPr>
+        <w:rPr>
+          <w:rFonts w:ascii="Times New Roman" w:cs="Times New Roman" w:eastAsia="Times New Roman" w:hAnsi="Times New Roman"/>
+          <w:sz w:val="26"/>
+          <w:szCs w:val="26"/>
+        </w:rPr>
+      </w:pPr>
+      <w:r>
+        <w:rPr>
+          <w:rFonts w:ascii="Times New Roman" w:cs="Times New Roman" w:eastAsia="Times New Roman" w:hAnsi="Times New Roman"/>
+          <w:sz w:val="26"/>
+          <w:szCs w:val="26"/>
+          <w:rtl w:val="0"/>
+        </w:rPr>
+        <w:t xml:space="preserve">NARRATOR: She slides her finger out.</w:t>
+      </w:r>
+    </w:p>
+    <w:p>
+      <w:pPr>
+        <w:rPr>
+          <w:rFonts w:ascii="Times New Roman" w:cs="Times New Roman" w:eastAsia="Times New Roman" w:hAnsi="Times New Roman"/>
+          <w:sz w:val="26"/>
+          <w:szCs w:val="26"/>
+        </w:rPr>
+      </w:pPr>
+      <w:r>
+        <w:rPr>
+          <w:rFonts w:ascii="Times New Roman" w:cs="Times New Roman" w:eastAsia="Times New Roman" w:hAnsi="Times New Roman"/>
+          <w:sz w:val="26"/>
+          <w:szCs w:val="26"/>
+          <w:rtl w:val="0"/>
+        </w:rPr>
+        <w:t xml:space="preserve">NARRATOR: The bug sounds like a ricecracker as it scrapes against the opening.</w:t>
+      </w:r>
+    </w:p>
+    <w:p>
+      <w:pPr>
+        <w:rPr>
+          <w:rFonts w:ascii="Times New Roman" w:cs="Times New Roman" w:eastAsia="Times New Roman" w:hAnsi="Times New Roman"/>
+          <w:sz w:val="26"/>
+          <w:szCs w:val="26"/>
+        </w:rPr>
+      </w:pPr>
+      <w:r>
+        <w:rPr>
+          <w:rFonts w:ascii="Times New Roman" w:cs="Times New Roman" w:eastAsia="Times New Roman" w:hAnsi="Times New Roman"/>
+          <w:sz w:val="26"/>
+          <w:szCs w:val="26"/>
+          <w:rtl w:val="0"/>
+        </w:rPr>
+        <w:t xml:space="preserve">NARRATOR: As it's about to tip from the edge, she secures it with her thumb.</w:t>
       </w:r>
     </w:p>
     <w:p>
@@ -689,43 +725,61 @@
           <w:szCs w:val="26"/>
           <w:rtl w:val="0"/>
         </w:rPr>
-        <w:t xml:space="preserve">NARRATOR: She says.</w:t>
-      </w:r>
-    </w:p>
-    <w:p>
-      <w:pPr>
-        <w:rPr>
-          <w:rFonts w:ascii="Times New Roman" w:cs="Times New Roman" w:eastAsia="Times New Roman" w:hAnsi="Times New Roman"/>
-          <w:sz w:val="26"/>
-          <w:szCs w:val="26"/>
-        </w:rPr>
-      </w:pPr>
-      <w:r>
-        <w:rPr>
-          <w:rFonts w:ascii="Times New Roman" w:cs="Times New Roman" w:eastAsia="Times New Roman" w:hAnsi="Times New Roman"/>
-          <w:sz w:val="26"/>
-          <w:szCs w:val="26"/>
-          <w:rtl w:val="0"/>
-        </w:rPr>
-        <w:t xml:space="preserve">ES: "Bugs really live down here still? What's up with that?"</w:t>
-      </w:r>
-    </w:p>
-    <w:p>
-      <w:pPr>
-        <w:rPr>
-          <w:rFonts w:ascii="Times New Roman" w:cs="Times New Roman" w:eastAsia="Times New Roman" w:hAnsi="Times New Roman"/>
-          <w:sz w:val="26"/>
-          <w:szCs w:val="26"/>
-        </w:rPr>
-      </w:pPr>
-      <w:r>
-        <w:rPr>
-          <w:rFonts w:ascii="Times New Roman" w:cs="Times New Roman" w:eastAsia="Times New Roman" w:hAnsi="Times New Roman"/>
-          <w:sz w:val="26"/>
-          <w:szCs w:val="26"/>
-          <w:rtl w:val="0"/>
-        </w:rPr>
-        <w:t xml:space="preserve">NARRATOR: The words come out dry like she isn't really asking. She wipes her finger on the wall and feels around again.</w:t>
+        <w:t xml:space="preserve">NARRATOR: She smiles.</w:t>
+      </w:r>
+    </w:p>
+    <w:p>
+      <w:pPr>
+        <w:rPr>
+          <w:rFonts w:ascii="Times New Roman" w:cs="Times New Roman" w:eastAsia="Times New Roman" w:hAnsi="Times New Roman"/>
+          <w:sz w:val="26"/>
+          <w:szCs w:val="26"/>
+        </w:rPr>
+      </w:pPr>
+      <w:r>
+        <w:rPr>
+          <w:rFonts w:ascii="Times New Roman" w:cs="Times New Roman" w:eastAsia="Times New Roman" w:hAnsi="Times New Roman"/>
+          <w:sz w:val="26"/>
+          <w:szCs w:val="26"/>
+          <w:rtl w:val="0"/>
+        </w:rPr>
+        <w:t xml:space="preserve">ES: "Finally some food."</w:t>
+      </w:r>
+    </w:p>
+    <w:p>
+      <w:pPr>
+        <w:rPr>
+          <w:rFonts w:ascii="Times New Roman" w:cs="Times New Roman" w:eastAsia="Times New Roman" w:hAnsi="Times New Roman"/>
+          <w:sz w:val="26"/>
+          <w:szCs w:val="26"/>
+        </w:rPr>
+      </w:pPr>
+      <w:r>
+        <w:rPr>
+          <w:rFonts w:ascii="Times New Roman" w:cs="Times New Roman" w:eastAsia="Times New Roman" w:hAnsi="Times New Roman"/>
+          <w:sz w:val="26"/>
+          <w:szCs w:val="26"/>
+          <w:rtl w:val="0"/>
+        </w:rPr>
+        <w:t xml:space="preserve">NARRATOR: She eats it and feels around again. </w:t>
+      </w:r>
+    </w:p>
+    <w:p>
+      <w:pPr>
+        <w:rPr>
+          <w:rFonts w:ascii="Times New Roman" w:cs="Times New Roman" w:eastAsia="Times New Roman" w:hAnsi="Times New Roman"/>
+          <w:sz w:val="26"/>
+          <w:szCs w:val="26"/>
+        </w:rPr>
+      </w:pPr>
+      <w:r>
+        <w:rPr>
+          <w:rFonts w:ascii="Times New Roman" w:cs="Times New Roman" w:eastAsia="Times New Roman" w:hAnsi="Times New Roman"/>
+          <w:sz w:val="26"/>
+          <w:szCs w:val="26"/>
+          <w:rtl w:val="0"/>
+        </w:rPr>
+        <w:t xml:space="preserve">NARRATOR: Another. Another.</w:t>
       </w:r>
     </w:p>
     <w:p>
@@ -761,25 +815,223 @@
           <w:szCs w:val="26"/>
           <w:rtl w:val="0"/>
         </w:rPr>
-        <w:t xml:space="preserve">NARRATOR: A sharp clatter breaks the quiet.</w:t>
-      </w:r>
-    </w:p>
-    <w:p>
-      <w:pPr>
-        <w:rPr>
-          <w:rFonts w:ascii="Times New Roman" w:cs="Times New Roman" w:eastAsia="Times New Roman" w:hAnsi="Times New Roman"/>
-          <w:sz w:val="26"/>
-          <w:szCs w:val="26"/>
-        </w:rPr>
-      </w:pPr>
-      <w:r>
-        <w:rPr>
-          <w:rFonts w:ascii="Times New Roman" w:cs="Times New Roman" w:eastAsia="Times New Roman" w:hAnsi="Times New Roman"/>
-          <w:sz w:val="26"/>
-          <w:szCs w:val="26"/>
-          <w:rtl w:val="0"/>
-        </w:rPr>
-        <w:t xml:space="preserve">NARRATOR: Es stands still. Her eyes stretch to their fullest breadth, honed in on the sound.</w:t>
+        <w:t xml:space="preserve">NARRATOR: Until a sharp clatter breaks the quiet.</w:t>
+      </w:r>
+    </w:p>
+    <w:p>
+      <w:pPr>
+        <w:rPr>
+          <w:rFonts w:ascii="Times New Roman" w:cs="Times New Roman" w:eastAsia="Times New Roman" w:hAnsi="Times New Roman"/>
+          <w:sz w:val="26"/>
+          <w:szCs w:val="26"/>
+        </w:rPr>
+      </w:pPr>
+      <w:r>
+        <w:rPr>
+          <w:rFonts w:ascii="Times New Roman" w:cs="Times New Roman" w:eastAsia="Times New Roman" w:hAnsi="Times New Roman"/>
+          <w:sz w:val="26"/>
+          <w:szCs w:val="26"/>
+          <w:rtl w:val="0"/>
+        </w:rPr>
+        <w:t xml:space="preserve">IMAGE: dist/images/eye.jpg</w:t>
+      </w:r>
+    </w:p>
+    <w:p>
+      <w:pPr>
+        <w:rPr>
+          <w:rFonts w:ascii="Times New Roman" w:cs="Times New Roman" w:eastAsia="Times New Roman" w:hAnsi="Times New Roman"/>
+          <w:sz w:val="26"/>
+          <w:szCs w:val="26"/>
+        </w:rPr>
+      </w:pPr>
+      <w:r>
+        <w:rPr>
+          <w:rFonts w:ascii="Times New Roman" w:cs="Times New Roman" w:eastAsia="Times New Roman" w:hAnsi="Times New Roman"/>
+          <w:sz w:val="26"/>
+          <w:szCs w:val="26"/>
+          <w:rtl w:val="0"/>
+        </w:rPr>
+        <w:t xml:space="preserve">NARRATOR: Her eyes stretch to their fullest breadth, honed in on the sound.</w:t>
+      </w:r>
+    </w:p>
+    <w:p>
+      <w:pPr>
+        <w:rPr>
+          <w:rFonts w:ascii="Times New Roman" w:cs="Times New Roman" w:eastAsia="Times New Roman" w:hAnsi="Times New Roman"/>
+          <w:sz w:val="26"/>
+          <w:szCs w:val="26"/>
+        </w:rPr>
+      </w:pPr>
+      <w:r>
+        <w:rPr>
+          <w:rFonts w:ascii="Times New Roman" w:cs="Times New Roman" w:eastAsia="Times New Roman" w:hAnsi="Times New Roman"/>
+          <w:sz w:val="26"/>
+          <w:szCs w:val="26"/>
+          <w:rtl w:val="0"/>
+        </w:rPr>
+        <w:t xml:space="preserve">NARRATOR: Shapes seem to morph in and out of the peripherals of the light.</w:t>
+      </w:r>
+    </w:p>
+    <w:p>
+      <w:pPr>
+        <w:rPr>
+          <w:rFonts w:ascii="Times New Roman" w:cs="Times New Roman" w:eastAsia="Times New Roman" w:hAnsi="Times New Roman"/>
+          <w:sz w:val="26"/>
+          <w:szCs w:val="26"/>
+        </w:rPr>
+      </w:pPr>
+      <w:r>
+        <w:rPr>
+          <w:rFonts w:ascii="Times New Roman" w:cs="Times New Roman" w:eastAsia="Times New Roman" w:hAnsi="Times New Roman"/>
+          <w:sz w:val="26"/>
+          <w:szCs w:val="26"/>
+          <w:rtl w:val="0"/>
+        </w:rPr>
+        <w:t xml:space="preserve">NARRATOR: Fuzzying inwards and outwards, but— No, is she seeing right?</w:t>
+      </w:r>
+    </w:p>
+    <w:p>
+      <w:pPr>
+        <w:rPr>
+          <w:rFonts w:ascii="Times New Roman" w:cs="Times New Roman" w:eastAsia="Times New Roman" w:hAnsi="Times New Roman"/>
+          <w:sz w:val="26"/>
+          <w:szCs w:val="26"/>
+        </w:rPr>
+      </w:pPr>
+      <w:r>
+        <w:rPr>
+          <w:rFonts w:ascii="Times New Roman" w:cs="Times New Roman" w:eastAsia="Times New Roman" w:hAnsi="Times New Roman"/>
+          <w:sz w:val="26"/>
+          <w:szCs w:val="26"/>
+          <w:rtl w:val="0"/>
+        </w:rPr>
+        <w:t xml:space="preserve">NARRATOR: Her finger chills where it is in the hole as she holds her breath, paying as close attention as she can. Fuzzying inwards and outwards. </w:t>
+      </w:r>
+    </w:p>
+    <w:p>
+      <w:pPr>
+        <w:rPr>
+          <w:rFonts w:ascii="Times New Roman" w:cs="Times New Roman" w:eastAsia="Times New Roman" w:hAnsi="Times New Roman"/>
+          <w:sz w:val="26"/>
+          <w:szCs w:val="26"/>
+        </w:rPr>
+      </w:pPr>
+      <w:r>
+        <w:rPr>
+          <w:rFonts w:ascii="Times New Roman" w:cs="Times New Roman" w:eastAsia="Times New Roman" w:hAnsi="Times New Roman"/>
+          <w:sz w:val="26"/>
+          <w:szCs w:val="26"/>
+          <w:rtl w:val="0"/>
+        </w:rPr>
+        <w:t xml:space="preserve">NARRATOR: A bucket. </w:t>
+      </w:r>
+    </w:p>
+    <w:p>
+      <w:pPr>
+        <w:rPr>
+          <w:rFonts w:ascii="Times New Roman" w:cs="Times New Roman" w:eastAsia="Times New Roman" w:hAnsi="Times New Roman"/>
+          <w:sz w:val="26"/>
+          <w:szCs w:val="26"/>
+        </w:rPr>
+      </w:pPr>
+      <w:r>
+        <w:rPr>
+          <w:rFonts w:ascii="Times New Roman" w:cs="Times New Roman" w:eastAsia="Times New Roman" w:hAnsi="Times New Roman"/>
+          <w:sz w:val="26"/>
+          <w:szCs w:val="26"/>
+          <w:rtl w:val="0"/>
+        </w:rPr>
+        <w:t xml:space="preserve">NARRATOR: Its rolled to a stop already.</w:t>
+      </w:r>
+    </w:p>
+    <w:p>
+      <w:pPr>
+        <w:rPr>
+          <w:rFonts w:ascii="Times New Roman" w:cs="Times New Roman" w:eastAsia="Times New Roman" w:hAnsi="Times New Roman"/>
+          <w:sz w:val="26"/>
+          <w:szCs w:val="26"/>
+        </w:rPr>
+      </w:pPr>
+      <w:r>
+        <w:rPr>
+          <w:rFonts w:ascii="Times New Roman" w:cs="Times New Roman" w:eastAsia="Times New Roman" w:hAnsi="Times New Roman"/>
+          <w:sz w:val="26"/>
+          <w:szCs w:val="26"/>
+          <w:rtl w:val="0"/>
+        </w:rPr>
+        <w:t xml:space="preserve">VOICE: "The Sun…"</w:t>
+      </w:r>
+    </w:p>
+    <w:p>
+      <w:pPr>
+        <w:rPr>
+          <w:rFonts w:ascii="Times New Roman" w:cs="Times New Roman" w:eastAsia="Times New Roman" w:hAnsi="Times New Roman"/>
+          <w:sz w:val="26"/>
+          <w:szCs w:val="26"/>
+        </w:rPr>
+      </w:pPr>
+      <w:r>
+        <w:rPr>
+          <w:rFonts w:ascii="Times New Roman" w:cs="Times New Roman" w:eastAsia="Times New Roman" w:hAnsi="Times New Roman"/>
+          <w:sz w:val="26"/>
+          <w:szCs w:val="26"/>
+          <w:rtl w:val="0"/>
+        </w:rPr>
+        <w:t xml:space="preserve">NARRATOR: A voice calls out in the darkness. </w:t>
+      </w:r>
+    </w:p>
+    <w:p>
+      <w:pPr>
+        <w:rPr>
+          <w:rFonts w:ascii="Times New Roman" w:cs="Times New Roman" w:eastAsia="Times New Roman" w:hAnsi="Times New Roman"/>
+          <w:sz w:val="26"/>
+          <w:szCs w:val="26"/>
+        </w:rPr>
+      </w:pPr>
+      <w:r>
+        <w:rPr>
+          <w:rFonts w:ascii="Times New Roman" w:cs="Times New Roman" w:eastAsia="Times New Roman" w:hAnsi="Times New Roman"/>
+          <w:sz w:val="26"/>
+          <w:szCs w:val="26"/>
+          <w:rtl w:val="0"/>
+        </w:rPr>
+        <w:t xml:space="preserve">NARRATOR: Es slides her finger from the hole. </w:t>
+      </w:r>
+    </w:p>
+    <w:p>
+      <w:pPr>
+        <w:rPr>
+          <w:rFonts w:ascii="Times New Roman" w:cs="Times New Roman" w:eastAsia="Times New Roman" w:hAnsi="Times New Roman"/>
+          <w:sz w:val="26"/>
+          <w:szCs w:val="26"/>
+        </w:rPr>
+      </w:pPr>
+      <w:r>
+        <w:rPr>
+          <w:rFonts w:ascii="Times New Roman" w:cs="Times New Roman" w:eastAsia="Times New Roman" w:hAnsi="Times New Roman"/>
+          <w:sz w:val="26"/>
+          <w:szCs w:val="26"/>
+          <w:rtl w:val="0"/>
+        </w:rPr>
+        <w:t xml:space="preserve">NARRATOR: The Sun /what?/</w:t>
+      </w:r>
+    </w:p>
+    <w:p>
+      <w:pPr>
+        <w:rPr>
+          <w:rFonts w:ascii="Times New Roman" w:cs="Times New Roman" w:eastAsia="Times New Roman" w:hAnsi="Times New Roman"/>
+          <w:sz w:val="26"/>
+          <w:szCs w:val="26"/>
+        </w:rPr>
+      </w:pPr>
+      <w:r>
+        <w:rPr>
+          <w:rFonts w:ascii="Times New Roman" w:cs="Times New Roman" w:eastAsia="Times New Roman" w:hAnsi="Times New Roman"/>
+          <w:sz w:val="26"/>
+          <w:szCs w:val="26"/>
+          <w:rtl w:val="0"/>
+        </w:rPr>
+        <w:t xml:space="preserve">NARRATOR: Es doesn’t want to stick around to know the answer.</w:t>
       </w:r>
     </w:p>
     <w:p>
@@ -815,7 +1067,57 @@
           <w:szCs w:val="26"/>
           <w:rtl w:val="0"/>
         </w:rPr>
-        <w:t xml:space="preserve">CHOICE: Do nothing -&gt; Basement_Ignored</w:t>
+        <w:t xml:space="preserve">SETS_FLAG: Aware_Of_Sun</w:t>
+      </w:r>
+    </w:p>
+    <w:p>
+      <w:pPr>
+        <w:rPr>
+          <w:rFonts w:ascii="Times New Roman" w:cs="Times New Roman" w:eastAsia="Times New Roman" w:hAnsi="Times New Roman"/>
+          <w:sz w:val="26"/>
+          <w:szCs w:val="26"/>
+        </w:rPr>
+      </w:pPr>
+      <w:r>
+        <w:rPr>
+          <w:rFonts w:ascii="Times New Roman" w:cs="Times New Roman" w:eastAsia="Times New Roman" w:hAnsi="Times New Roman"/>
+          <w:sz w:val="26"/>
+          <w:szCs w:val="26"/>
+          <w:rtl w:val="0"/>
+        </w:rPr>
+        <w:t xml:space="preserve">CHOICE: Run -&gt; Basement_Run</w:t>
+      </w:r>
+    </w:p>
+    <w:p>
+      <w:pPr>
+        <w:rPr>
+          <w:rFonts w:ascii="Times New Roman" w:cs="Times New Roman" w:eastAsia="Times New Roman" w:hAnsi="Times New Roman"/>
+          <w:sz w:val="26"/>
+          <w:szCs w:val="26"/>
+        </w:rPr>
+      </w:pPr>
+      <w:r>
+        <w:rPr>
+          <w:rFonts w:ascii="Times New Roman" w:cs="Times New Roman" w:eastAsia="Times New Roman" w:hAnsi="Times New Roman"/>
+          <w:sz w:val="26"/>
+          <w:szCs w:val="26"/>
+          <w:rtl w:val="0"/>
+        </w:rPr>
+        <w:t xml:space="preserve">SETS_FLAG: Unaware_Of_Sun</w:t>
+      </w:r>
+    </w:p>
+    <w:p>
+      <w:pPr>
+        <w:rPr>
+          <w:rFonts w:ascii="Times New Roman" w:cs="Times New Roman" w:eastAsia="Times New Roman" w:hAnsi="Times New Roman"/>
+          <w:sz w:val="26"/>
+          <w:szCs w:val="26"/>
+        </w:rPr>
+      </w:pPr>
+      <w:r>
+        <w:rPr>
+          <w:rtl w:val="0"/>
+        </w:rPr>
       </w:r>
     </w:p>
     <w:p>
@@ -901,25 +1203,259 @@
           <w:szCs w:val="26"/>
           <w:rtl w:val="0"/>
         </w:rPr>
-        <w:t xml:space="preserve">NARRATOR: A voice calls out in the darkness:</w:t>
-      </w:r>
-    </w:p>
-    <w:p>
-      <w:pPr>
-        <w:rPr>
-          <w:rFonts w:ascii="Times New Roman" w:cs="Times New Roman" w:eastAsia="Times New Roman" w:hAnsi="Times New Roman"/>
-          <w:sz w:val="26"/>
-          <w:szCs w:val="26"/>
-        </w:rPr>
-      </w:pPr>
-      <w:r>
-        <w:rPr>
-          <w:rFonts w:ascii="Times New Roman" w:cs="Times New Roman" w:eastAsia="Times New Roman" w:hAnsi="Times New Roman"/>
-          <w:sz w:val="26"/>
-          <w:szCs w:val="26"/>
-          <w:rtl w:val="0"/>
-        </w:rPr>
-        <w:t xml:space="preserve">VOICE: "Help me."</w:t>
+        <w:t xml:space="preserve">NARRATOR: It calls out again:</w:t>
+      </w:r>
+    </w:p>
+    <w:p>
+      <w:pPr>
+        <w:rPr>
+          <w:rFonts w:ascii="Times New Roman" w:cs="Times New Roman" w:eastAsia="Times New Roman" w:hAnsi="Times New Roman"/>
+          <w:sz w:val="26"/>
+          <w:szCs w:val="26"/>
+        </w:rPr>
+      </w:pPr>
+      <w:r>
+        <w:rPr>
+          <w:rFonts w:ascii="Times New Roman" w:cs="Times New Roman" w:eastAsia="Times New Roman" w:hAnsi="Times New Roman"/>
+          <w:sz w:val="26"/>
+          <w:szCs w:val="26"/>
+          <w:rtl w:val="0"/>
+        </w:rPr>
+        <w:t xml:space="preserve">VOICE: "Sun has…"</w:t>
+      </w:r>
+    </w:p>
+    <w:p>
+      <w:pPr>
+        <w:rPr>
+          <w:rFonts w:ascii="Times New Roman" w:cs="Times New Roman" w:eastAsia="Times New Roman" w:hAnsi="Times New Roman"/>
+          <w:sz w:val="26"/>
+          <w:szCs w:val="26"/>
+        </w:rPr>
+      </w:pPr>
+      <w:r>
+        <w:rPr>
+          <w:rFonts w:ascii="Times New Roman" w:cs="Times New Roman" w:eastAsia="Times New Roman" w:hAnsi="Times New Roman"/>
+          <w:sz w:val="26"/>
+          <w:szCs w:val="26"/>
+          <w:rtl w:val="0"/>
+        </w:rPr>
+        <w:t xml:space="preserve">IMAGE:</w:t>
+      </w:r>
+    </w:p>
+    <w:p>
+      <w:pPr>
+        <w:rPr>
+          <w:rFonts w:ascii="Times New Roman" w:cs="Times New Roman" w:eastAsia="Times New Roman" w:hAnsi="Times New Roman"/>
+          <w:sz w:val="26"/>
+          <w:szCs w:val="26"/>
+        </w:rPr>
+      </w:pPr>
+      <w:r>
+        <w:rPr>
+          <w:rFonts w:ascii="Times New Roman" w:cs="Times New Roman" w:eastAsia="Times New Roman" w:hAnsi="Times New Roman"/>
+          <w:sz w:val="26"/>
+          <w:szCs w:val="26"/>
+          <w:rtl w:val="0"/>
+        </w:rPr>
+        <w:t xml:space="preserve">NARRATOR: The lightbulb inhibits her sight any further into the basement.</w:t>
+      </w:r>
+    </w:p>
+    <w:p>
+      <w:pPr>
+        <w:rPr>
+          <w:rFonts w:ascii="Times New Roman" w:cs="Times New Roman" w:eastAsia="Times New Roman" w:hAnsi="Times New Roman"/>
+          <w:sz w:val="26"/>
+          <w:szCs w:val="26"/>
+        </w:rPr>
+      </w:pPr>
+      <w:r>
+        <w:rPr>
+          <w:rFonts w:ascii="Times New Roman" w:cs="Times New Roman" w:eastAsia="Times New Roman" w:hAnsi="Times New Roman"/>
+          <w:sz w:val="26"/>
+          <w:szCs w:val="26"/>
+          <w:rtl w:val="0"/>
+        </w:rPr>
+        <w:t xml:space="preserve">IMAGE:</w:t>
+      </w:r>
+    </w:p>
+    <w:p>
+      <w:pPr>
+        <w:rPr>
+          <w:rFonts w:ascii="Times New Roman" w:cs="Times New Roman" w:eastAsia="Times New Roman" w:hAnsi="Times New Roman"/>
+          <w:sz w:val="26"/>
+          <w:szCs w:val="26"/>
+        </w:rPr>
+      </w:pPr>
+      <w:r>
+        <w:rPr>
+          <w:rFonts w:ascii="Times New Roman" w:cs="Times New Roman" w:eastAsia="Times New Roman" w:hAnsi="Times New Roman"/>
+          <w:sz w:val="26"/>
+          <w:szCs w:val="26"/>
+          <w:rtl w:val="0"/>
+        </w:rPr>
+        <w:t xml:space="preserve">NARRATOR: Something’s moving in there.</w:t>
+      </w:r>
+    </w:p>
+    <w:p>
+      <w:pPr>
+        <w:rPr>
+          <w:rFonts w:ascii="Times New Roman" w:cs="Times New Roman" w:eastAsia="Times New Roman" w:hAnsi="Times New Roman"/>
+          <w:sz w:val="26"/>
+          <w:szCs w:val="26"/>
+        </w:rPr>
+      </w:pPr>
+      <w:r>
+        <w:rPr>
+          <w:rFonts w:ascii="Times New Roman" w:cs="Times New Roman" w:eastAsia="Times New Roman" w:hAnsi="Times New Roman"/>
+          <w:sz w:val="26"/>
+          <w:szCs w:val="26"/>
+          <w:rtl w:val="0"/>
+        </w:rPr>
+        <w:t xml:space="preserve">CHOICE: Answer -&gt; Basement_Answer</w:t>
+      </w:r>
+    </w:p>
+    <w:p>
+      <w:pPr>
+        <w:rPr>
+          <w:rFonts w:ascii="Times New Roman" w:cs="Times New Roman" w:eastAsia="Times New Roman" w:hAnsi="Times New Roman"/>
+          <w:sz w:val="26"/>
+          <w:szCs w:val="26"/>
+        </w:rPr>
+      </w:pPr>
+      <w:r>
+        <w:rPr>
+          <w:rFonts w:ascii="Times New Roman" w:cs="Times New Roman" w:eastAsia="Times New Roman" w:hAnsi="Times New Roman"/>
+          <w:sz w:val="26"/>
+          <w:szCs w:val="26"/>
+          <w:rtl w:val="0"/>
+        </w:rPr>
+        <w:t xml:space="preserve">CHOICE: Stay quiet -&gt; Basement_Silent</w:t>
+      </w:r>
+    </w:p>
+    <w:p>
+      <w:pPr>
+        <w:rPr>
+          <w:rFonts w:ascii="Times New Roman" w:cs="Times New Roman" w:eastAsia="Times New Roman" w:hAnsi="Times New Roman"/>
+          <w:sz w:val="26"/>
+          <w:szCs w:val="26"/>
+        </w:rPr>
+      </w:pPr>
+      <w:r>
+        <w:rPr>
+          <w:rFonts w:ascii="Times New Roman" w:cs="Times New Roman" w:eastAsia="Times New Roman" w:hAnsi="Times New Roman"/>
+          <w:sz w:val="26"/>
+          <w:szCs w:val="26"/>
+          <w:rtl w:val="0"/>
+        </w:rPr>
+        <w:t xml:space="preserve">NODE: Basement_Run</w:t>
+      </w:r>
+    </w:p>
+    <w:p>
+      <w:pPr>
+        <w:rPr>
+          <w:rFonts w:ascii="Times New Roman" w:cs="Times New Roman" w:eastAsia="Times New Roman" w:hAnsi="Times New Roman"/>
+          <w:sz w:val="26"/>
+          <w:szCs w:val="26"/>
+        </w:rPr>
+      </w:pPr>
+      <w:r>
+        <w:rPr>
+          <w:rFonts w:ascii="Times New Roman" w:cs="Times New Roman" w:eastAsia="Times New Roman" w:hAnsi="Times New Roman"/>
+          <w:sz w:val="26"/>
+          <w:szCs w:val="26"/>
+          <w:rtl w:val="0"/>
+        </w:rPr>
+        <w:t xml:space="preserve">NARRATOR: She bolts.</w:t>
+      </w:r>
+    </w:p>
+    <w:p>
+      <w:pPr>
+        <w:rPr>
+          <w:rFonts w:ascii="Times New Roman" w:cs="Times New Roman" w:eastAsia="Times New Roman" w:hAnsi="Times New Roman"/>
+          <w:sz w:val="26"/>
+          <w:szCs w:val="26"/>
+        </w:rPr>
+      </w:pPr>
+      <w:r>
+        <w:rPr>
+          <w:rFonts w:ascii="Times New Roman" w:cs="Times New Roman" w:eastAsia="Times New Roman" w:hAnsi="Times New Roman"/>
+          <w:sz w:val="26"/>
+          <w:szCs w:val="26"/>
+          <w:rtl w:val="0"/>
+        </w:rPr>
+        <w:t xml:space="preserve">NARRATOR: Es stumbles as she reaches the stairs and feels around the railing.</w:t>
+      </w:r>
+    </w:p>
+    <w:p>
+      <w:pPr>
+        <w:rPr>
+          <w:rFonts w:ascii="Times New Roman" w:cs="Times New Roman" w:eastAsia="Times New Roman" w:hAnsi="Times New Roman"/>
+          <w:sz w:val="26"/>
+          <w:szCs w:val="26"/>
+        </w:rPr>
+      </w:pPr>
+      <w:r>
+        <w:rPr>
+          <w:rFonts w:ascii="Times New Roman" w:cs="Times New Roman" w:eastAsia="Times New Roman" w:hAnsi="Times New Roman"/>
+          <w:sz w:val="26"/>
+          <w:szCs w:val="26"/>
+          <w:rtl w:val="0"/>
+        </w:rPr>
+        <w:t xml:space="preserve">NARRATOR: The top of her foot slams atop one of the stairs and sends searing pain throughout her entire leg.</w:t>
+      </w:r>
+    </w:p>
+    <w:p>
+      <w:pPr>
+        <w:rPr>
+          <w:rFonts w:ascii="Times New Roman" w:cs="Times New Roman" w:eastAsia="Times New Roman" w:hAnsi="Times New Roman"/>
+          <w:sz w:val="26"/>
+          <w:szCs w:val="26"/>
+        </w:rPr>
+      </w:pPr>
+      <w:r>
+        <w:rPr>
+          <w:rFonts w:ascii="Times New Roman" w:cs="Times New Roman" w:eastAsia="Times New Roman" w:hAnsi="Times New Roman"/>
+          <w:sz w:val="26"/>
+          <w:szCs w:val="26"/>
+          <w:rtl w:val="0"/>
+        </w:rPr>
+        <w:t xml:space="preserve">NARRATOR: But she keeps going.</w:t>
+      </w:r>
+    </w:p>
+    <w:p>
+      <w:pPr>
+        <w:rPr>
+          <w:rFonts w:ascii="Times New Roman" w:cs="Times New Roman" w:eastAsia="Times New Roman" w:hAnsi="Times New Roman"/>
+          <w:sz w:val="26"/>
+          <w:szCs w:val="26"/>
+        </w:rPr>
+      </w:pPr>
+      <w:r>
+        <w:rPr>
+          <w:rFonts w:ascii="Times New Roman" w:cs="Times New Roman" w:eastAsia="Times New Roman" w:hAnsi="Times New Roman"/>
+          <w:sz w:val="26"/>
+          <w:szCs w:val="26"/>
+          <w:rtl w:val="0"/>
+        </w:rPr>
+        <w:t xml:space="preserve">ES: Come on, come on…!</w:t>
+      </w:r>
+    </w:p>
+    <w:p>
+      <w:pPr>
+        <w:rPr>
+          <w:rFonts w:ascii="Times New Roman" w:cs="Times New Roman" w:eastAsia="Times New Roman" w:hAnsi="Times New Roman"/>
+          <w:sz w:val="26"/>
+          <w:szCs w:val="26"/>
+        </w:rPr>
+      </w:pPr>
+      <w:r>
+        <w:rPr>
+          <w:rFonts w:ascii="Times New Roman" w:cs="Times New Roman" w:eastAsia="Times New Roman" w:hAnsi="Times New Roman"/>
+          <w:sz w:val="26"/>
+          <w:szCs w:val="26"/>
+          <w:rtl w:val="0"/>
+        </w:rPr>
+        <w:t xml:space="preserve">NARRATOR: By the time she’s at the top, she’s already slammed open the door and stumbled into the outside.</w:t>
       </w:r>
     </w:p>
     <w:p>
@@ -969,25 +1505,647 @@
           <w:szCs w:val="26"/>
           <w:rtl w:val="0"/>
         </w:rPr>
-        <w:t xml:space="preserve">NODE: Basement_Ignored</w:t>
-      </w:r>
-    </w:p>
-    <w:p>
-      <w:pPr>
-        <w:rPr>
-          <w:rFonts w:ascii="Times New Roman" w:cs="Times New Roman" w:eastAsia="Times New Roman" w:hAnsi="Times New Roman"/>
-          <w:sz w:val="26"/>
-          <w:szCs w:val="26"/>
-        </w:rPr>
-      </w:pPr>
-      <w:r>
-        <w:rPr>
-          <w:rFonts w:ascii="Times New Roman" w:cs="Times New Roman" w:eastAsia="Times New Roman" w:hAnsi="Times New Roman"/>
-          <w:sz w:val="26"/>
-          <w:szCs w:val="26"/>
-          <w:rtl w:val="0"/>
-        </w:rPr>
-        <w:t xml:space="preserve">NARRATOR: TODO</w:t>
+        <w:t xml:space="preserve">NODE: Basement_Answer</w:t>
+      </w:r>
+    </w:p>
+    <w:p>
+      <w:pPr>
+        <w:rPr>
+          <w:rFonts w:ascii="Times New Roman" w:cs="Times New Roman" w:eastAsia="Times New Roman" w:hAnsi="Times New Roman"/>
+          <w:sz w:val="26"/>
+          <w:szCs w:val="26"/>
+        </w:rPr>
+      </w:pPr>
+      <w:r>
+        <w:rPr>
+          <w:rFonts w:ascii="Times New Roman" w:cs="Times New Roman" w:eastAsia="Times New Roman" w:hAnsi="Times New Roman"/>
+          <w:sz w:val="26"/>
+          <w:szCs w:val="26"/>
+          <w:rtl w:val="0"/>
+        </w:rPr>
+        <w:t xml:space="preserve">IMAGE:</w:t>
+      </w:r>
+    </w:p>
+    <w:p>
+      <w:pPr>
+        <w:rPr>
+          <w:rFonts w:ascii="Times New Roman" w:cs="Times New Roman" w:eastAsia="Times New Roman" w:hAnsi="Times New Roman"/>
+          <w:sz w:val="26"/>
+          <w:szCs w:val="26"/>
+        </w:rPr>
+      </w:pPr>
+      <w:r>
+        <w:rPr>
+          <w:rFonts w:ascii="Times New Roman" w:cs="Times New Roman" w:eastAsia="Times New Roman" w:hAnsi="Times New Roman"/>
+          <w:sz w:val="26"/>
+          <w:szCs w:val="26"/>
+          <w:rtl w:val="0"/>
+        </w:rPr>
+        <w:t xml:space="preserve">ES: "Whadd’you want?"</w:t>
+      </w:r>
+    </w:p>
+    <w:p>
+      <w:pPr>
+        <w:rPr>
+          <w:rFonts w:ascii="Times New Roman" w:cs="Times New Roman" w:eastAsia="Times New Roman" w:hAnsi="Times New Roman"/>
+          <w:sz w:val="26"/>
+          <w:szCs w:val="26"/>
+        </w:rPr>
+      </w:pPr>
+      <w:r>
+        <w:rPr>
+          <w:rFonts w:ascii="Times New Roman" w:cs="Times New Roman" w:eastAsia="Times New Roman" w:hAnsi="Times New Roman"/>
+          <w:sz w:val="26"/>
+          <w:szCs w:val="26"/>
+          <w:rtl w:val="0"/>
+        </w:rPr>
+        <w:t xml:space="preserve">NARRATOR: Nothing’s moving in there.</w:t>
+      </w:r>
+    </w:p>
+    <w:p>
+      <w:pPr>
+        <w:rPr>
+          <w:rFonts w:ascii="Times New Roman" w:cs="Times New Roman" w:eastAsia="Times New Roman" w:hAnsi="Times New Roman"/>
+          <w:sz w:val="26"/>
+          <w:szCs w:val="26"/>
+        </w:rPr>
+      </w:pPr>
+      <w:r>
+        <w:rPr>
+          <w:rFonts w:ascii="Times New Roman" w:cs="Times New Roman" w:eastAsia="Times New Roman" w:hAnsi="Times New Roman"/>
+          <w:sz w:val="26"/>
+          <w:szCs w:val="26"/>
+          <w:rtl w:val="0"/>
+        </w:rPr>
+        <w:t xml:space="preserve">NARRATOR: The voice answers with just a voice and no other physical presence aside from the bucket. </w:t>
+      </w:r>
+    </w:p>
+    <w:p>
+      <w:pPr>
+        <w:rPr>
+          <w:rFonts w:ascii="Times New Roman" w:cs="Times New Roman" w:eastAsia="Times New Roman" w:hAnsi="Times New Roman"/>
+          <w:sz w:val="26"/>
+          <w:szCs w:val="26"/>
+        </w:rPr>
+      </w:pPr>
+      <w:r>
+        <w:rPr>
+          <w:rFonts w:ascii="Times New Roman" w:cs="Times New Roman" w:eastAsia="Times New Roman" w:hAnsi="Times New Roman"/>
+          <w:sz w:val="26"/>
+          <w:szCs w:val="26"/>
+          <w:rtl w:val="0"/>
+        </w:rPr>
+        <w:t xml:space="preserve">VOICE: "You us…"</w:t>
+      </w:r>
+    </w:p>
+    <w:p>
+      <w:pPr>
+        <w:rPr>
+          <w:rFonts w:ascii="Times New Roman" w:cs="Times New Roman" w:eastAsia="Times New Roman" w:hAnsi="Times New Roman"/>
+          <w:sz w:val="26"/>
+          <w:szCs w:val="26"/>
+        </w:rPr>
+      </w:pPr>
+      <w:r>
+        <w:rPr>
+          <w:rFonts w:ascii="Times New Roman" w:cs="Times New Roman" w:eastAsia="Times New Roman" w:hAnsi="Times New Roman"/>
+          <w:sz w:val="26"/>
+          <w:szCs w:val="26"/>
+          <w:rtl w:val="0"/>
+        </w:rPr>
+        <w:t xml:space="preserve">NEXT: Basement_Dead_Sun</w:t>
+      </w:r>
+    </w:p>
+    <w:p>
+      <w:pPr>
+        <w:rPr>
+          <w:rFonts w:ascii="Times New Roman" w:cs="Times New Roman" w:eastAsia="Times New Roman" w:hAnsi="Times New Roman"/>
+          <w:sz w:val="26"/>
+          <w:szCs w:val="26"/>
+        </w:rPr>
+      </w:pPr>
+      <w:r>
+        <w:rPr>
+          <w:rtl w:val="0"/>
+        </w:rPr>
+      </w:r>
+    </w:p>
+    <w:p>
+      <w:pPr>
+        <w:rPr>
+          <w:rFonts w:ascii="Times New Roman" w:cs="Times New Roman" w:eastAsia="Times New Roman" w:hAnsi="Times New Roman"/>
+          <w:sz w:val="26"/>
+          <w:szCs w:val="26"/>
+        </w:rPr>
+      </w:pPr>
+      <w:r>
+        <w:rPr>
+          <w:rFonts w:ascii="Times New Roman" w:cs="Times New Roman" w:eastAsia="Times New Roman" w:hAnsi="Times New Roman"/>
+          <w:sz w:val="26"/>
+          <w:szCs w:val="26"/>
+          <w:rtl w:val="0"/>
+        </w:rPr>
+        <w:t xml:space="preserve">NODE: Basement_Silent</w:t>
+      </w:r>
+    </w:p>
+    <w:p>
+      <w:pPr>
+        <w:rPr>
+          <w:rFonts w:ascii="Times New Roman" w:cs="Times New Roman" w:eastAsia="Times New Roman" w:hAnsi="Times New Roman"/>
+          <w:sz w:val="26"/>
+          <w:szCs w:val="26"/>
+        </w:rPr>
+      </w:pPr>
+      <w:r>
+        <w:rPr>
+          <w:rFonts w:ascii="Times New Roman" w:cs="Times New Roman" w:eastAsia="Times New Roman" w:hAnsi="Times New Roman"/>
+          <w:sz w:val="26"/>
+          <w:szCs w:val="26"/>
+          <w:rtl w:val="0"/>
+        </w:rPr>
+        <w:t xml:space="preserve">NARRATOR: Es stays silent. Better to stay quiet than get caught by whatever Dead is in there.</w:t>
+      </w:r>
+    </w:p>
+    <w:p>
+      <w:pPr>
+        <w:rPr>
+          <w:rFonts w:ascii="Times New Roman" w:cs="Times New Roman" w:eastAsia="Times New Roman" w:hAnsi="Times New Roman"/>
+          <w:sz w:val="26"/>
+          <w:szCs w:val="26"/>
+        </w:rPr>
+      </w:pPr>
+      <w:r>
+        <w:rPr>
+          <w:rFonts w:ascii="Times New Roman" w:cs="Times New Roman" w:eastAsia="Times New Roman" w:hAnsi="Times New Roman"/>
+          <w:sz w:val="26"/>
+          <w:szCs w:val="26"/>
+          <w:rtl w:val="0"/>
+        </w:rPr>
+        <w:t xml:space="preserve">ES: Wait for it to leave, then run.</w:t>
+      </w:r>
+    </w:p>
+    <w:p>
+      <w:pPr>
+        <w:rPr>
+          <w:rFonts w:ascii="Times New Roman" w:cs="Times New Roman" w:eastAsia="Times New Roman" w:hAnsi="Times New Roman"/>
+          <w:sz w:val="26"/>
+          <w:szCs w:val="26"/>
+        </w:rPr>
+      </w:pPr>
+      <w:r>
+        <w:rPr>
+          <w:rFonts w:ascii="Times New Roman" w:cs="Times New Roman" w:eastAsia="Times New Roman" w:hAnsi="Times New Roman"/>
+          <w:sz w:val="26"/>
+          <w:szCs w:val="26"/>
+          <w:rtl w:val="0"/>
+        </w:rPr>
+        <w:t xml:space="preserve">NARRATOR: She grinds her teeth in anticipation.</w:t>
+      </w:r>
+    </w:p>
+    <w:p>
+      <w:pPr>
+        <w:rPr>
+          <w:rFonts w:ascii="Times New Roman" w:cs="Times New Roman" w:eastAsia="Times New Roman" w:hAnsi="Times New Roman"/>
+          <w:sz w:val="26"/>
+          <w:szCs w:val="26"/>
+        </w:rPr>
+      </w:pPr>
+      <w:r>
+        <w:rPr>
+          <w:rFonts w:ascii="Times New Roman" w:cs="Times New Roman" w:eastAsia="Times New Roman" w:hAnsi="Times New Roman"/>
+          <w:sz w:val="26"/>
+          <w:szCs w:val="26"/>
+          <w:rtl w:val="0"/>
+        </w:rPr>
+        <w:t xml:space="preserve">NEXT: Basement_Dead_Sun</w:t>
+      </w:r>
+    </w:p>
+    <w:p>
+      <w:pPr>
+        <w:rPr>
+          <w:rFonts w:ascii="Times New Roman" w:cs="Times New Roman" w:eastAsia="Times New Roman" w:hAnsi="Times New Roman"/>
+          <w:sz w:val="26"/>
+          <w:szCs w:val="26"/>
+        </w:rPr>
+      </w:pPr>
+      <w:r>
+        <w:rPr>
+          <w:rtl w:val="0"/>
+        </w:rPr>
+      </w:r>
+    </w:p>
+    <w:p>
+      <w:pPr>
+        <w:rPr>
+          <w:rFonts w:ascii="Times New Roman" w:cs="Times New Roman" w:eastAsia="Times New Roman" w:hAnsi="Times New Roman"/>
+          <w:sz w:val="26"/>
+          <w:szCs w:val="26"/>
+        </w:rPr>
+      </w:pPr>
+      <w:r>
+        <w:rPr>
+          <w:rFonts w:ascii="Times New Roman" w:cs="Times New Roman" w:eastAsia="Times New Roman" w:hAnsi="Times New Roman"/>
+          <w:sz w:val="26"/>
+          <w:szCs w:val="26"/>
+          <w:rtl w:val="0"/>
+        </w:rPr>
+        <w:t xml:space="preserve">NODE: Basement_Dead_Sun</w:t>
+      </w:r>
+    </w:p>
+    <w:p>
+      <w:pPr>
+        <w:rPr>
+          <w:rFonts w:ascii="Times New Roman" w:cs="Times New Roman" w:eastAsia="Times New Roman" w:hAnsi="Times New Roman"/>
+          <w:sz w:val="26"/>
+          <w:szCs w:val="26"/>
+        </w:rPr>
+      </w:pPr>
+      <w:r>
+        <w:rPr>
+          <w:rFonts w:ascii="Times New Roman" w:cs="Times New Roman" w:eastAsia="Times New Roman" w:hAnsi="Times New Roman"/>
+          <w:sz w:val="26"/>
+          <w:szCs w:val="26"/>
+          <w:rtl w:val="0"/>
+        </w:rPr>
+        <w:t xml:space="preserve">VOICE: Croak.</w:t>
+      </w:r>
+    </w:p>
+    <w:p>
+      <w:pPr>
+        <w:rPr>
+          <w:rFonts w:ascii="Times New Roman" w:cs="Times New Roman" w:eastAsia="Times New Roman" w:hAnsi="Times New Roman"/>
+          <w:sz w:val="26"/>
+          <w:szCs w:val="26"/>
+        </w:rPr>
+      </w:pPr>
+      <w:r>
+        <w:rPr>
+          <w:rFonts w:ascii="Times New Roman" w:cs="Times New Roman" w:eastAsia="Times New Roman" w:hAnsi="Times New Roman"/>
+          <w:sz w:val="26"/>
+          <w:szCs w:val="26"/>
+          <w:rtl w:val="0"/>
+        </w:rPr>
+        <w:t xml:space="preserve">IMAGE: dist/images/lightbulb.jpg</w:t>
+      </w:r>
+    </w:p>
+    <w:p>
+      <w:pPr>
+        <w:rPr>
+          <w:rFonts w:ascii="Times New Roman" w:cs="Times New Roman" w:eastAsia="Times New Roman" w:hAnsi="Times New Roman"/>
+          <w:sz w:val="26"/>
+          <w:szCs w:val="26"/>
+        </w:rPr>
+      </w:pPr>
+      <w:r>
+        <w:rPr>
+          <w:rFonts w:ascii="Times New Roman" w:cs="Times New Roman" w:eastAsia="Times New Roman" w:hAnsi="Times New Roman"/>
+          <w:sz w:val="26"/>
+          <w:szCs w:val="26"/>
+          <w:rtl w:val="0"/>
+        </w:rPr>
+        <w:t xml:space="preserve">NARRATOR: It half chokes on something.</w:t>
+      </w:r>
+    </w:p>
+    <w:p>
+      <w:pPr>
+        <w:rPr>
+          <w:rFonts w:ascii="Times New Roman" w:cs="Times New Roman" w:eastAsia="Times New Roman" w:hAnsi="Times New Roman"/>
+          <w:sz w:val="26"/>
+          <w:szCs w:val="26"/>
+        </w:rPr>
+      </w:pPr>
+      <w:r>
+        <w:rPr>
+          <w:rFonts w:ascii="Times New Roman" w:cs="Times New Roman" w:eastAsia="Times New Roman" w:hAnsi="Times New Roman"/>
+          <w:sz w:val="26"/>
+          <w:szCs w:val="26"/>
+          <w:rtl w:val="0"/>
+        </w:rPr>
+        <w:t xml:space="preserve">NARRATOR: Es’ back scrapes against the wall.</w:t>
+      </w:r>
+    </w:p>
+    <w:p>
+      <w:pPr>
+        <w:rPr>
+          <w:rFonts w:ascii="Times New Roman" w:cs="Times New Roman" w:eastAsia="Times New Roman" w:hAnsi="Times New Roman"/>
+          <w:sz w:val="26"/>
+          <w:szCs w:val="26"/>
+        </w:rPr>
+      </w:pPr>
+      <w:r>
+        <w:rPr>
+          <w:rFonts w:ascii="Times New Roman" w:cs="Times New Roman" w:eastAsia="Times New Roman" w:hAnsi="Times New Roman"/>
+          <w:sz w:val="26"/>
+          <w:szCs w:val="26"/>
+          <w:rtl w:val="0"/>
+        </w:rPr>
+        <w:t xml:space="preserve">NARRATOR: She slowly rises to her feet, and her toes curl in the sediment. </w:t>
+      </w:r>
+    </w:p>
+    <w:p>
+      <w:pPr>
+        <w:rPr>
+          <w:rFonts w:ascii="Times New Roman" w:cs="Times New Roman" w:eastAsia="Times New Roman" w:hAnsi="Times New Roman"/>
+          <w:sz w:val="26"/>
+          <w:szCs w:val="26"/>
+        </w:rPr>
+      </w:pPr>
+      <w:r>
+        <w:rPr>
+          <w:rFonts w:ascii="Times New Roman" w:cs="Times New Roman" w:eastAsia="Times New Roman" w:hAnsi="Times New Roman"/>
+          <w:sz w:val="26"/>
+          <w:szCs w:val="26"/>
+          <w:rtl w:val="0"/>
+        </w:rPr>
+        <w:t xml:space="preserve">ES: Alright. On three…</w:t>
+      </w:r>
+    </w:p>
+    <w:p>
+      <w:pPr>
+        <w:rPr>
+          <w:rFonts w:ascii="Times New Roman" w:cs="Times New Roman" w:eastAsia="Times New Roman" w:hAnsi="Times New Roman"/>
+          <w:sz w:val="26"/>
+          <w:szCs w:val="26"/>
+        </w:rPr>
+      </w:pPr>
+      <w:r>
+        <w:rPr>
+          <w:rFonts w:ascii="Times New Roman" w:cs="Times New Roman" w:eastAsia="Times New Roman" w:hAnsi="Times New Roman"/>
+          <w:sz w:val="26"/>
+          <w:szCs w:val="26"/>
+          <w:rtl w:val="0"/>
+        </w:rPr>
+        <w:t xml:space="preserve">IMAGE: </w:t>
+      </w:r>
+    </w:p>
+    <w:p>
+      <w:pPr>
+        <w:rPr>
+          <w:rFonts w:ascii="Times New Roman" w:cs="Times New Roman" w:eastAsia="Times New Roman" w:hAnsi="Times New Roman"/>
+          <w:sz w:val="26"/>
+          <w:szCs w:val="26"/>
+        </w:rPr>
+      </w:pPr>
+      <w:r>
+        <w:rPr>
+          <w:rFonts w:ascii="Times New Roman" w:cs="Times New Roman" w:eastAsia="Times New Roman" w:hAnsi="Times New Roman"/>
+          <w:sz w:val="26"/>
+          <w:szCs w:val="26"/>
+          <w:rtl w:val="0"/>
+        </w:rPr>
+        <w:t xml:space="preserve">NARRATOR: Es looks up at the door she came in—at the long slope of stairs.</w:t>
+      </w:r>
+    </w:p>
+    <w:p>
+      <w:pPr>
+        <w:rPr>
+          <w:rFonts w:ascii="Times New Roman" w:cs="Times New Roman" w:eastAsia="Times New Roman" w:hAnsi="Times New Roman"/>
+          <w:sz w:val="26"/>
+          <w:szCs w:val="26"/>
+        </w:rPr>
+      </w:pPr>
+      <w:r>
+        <w:rPr>
+          <w:rFonts w:ascii="Times New Roman" w:cs="Times New Roman" w:eastAsia="Times New Roman" w:hAnsi="Times New Roman"/>
+          <w:sz w:val="26"/>
+          <w:szCs w:val="26"/>
+          <w:rtl w:val="0"/>
+        </w:rPr>
+        <w:t xml:space="preserve">NARRATOR: She can make it if she tries. The Dead doesn’t have a body so it can’t hurt her anyway.</w:t>
+      </w:r>
+    </w:p>
+    <w:p>
+      <w:pPr>
+        <w:rPr>
+          <w:rFonts w:ascii="Times New Roman" w:cs="Times New Roman" w:eastAsia="Times New Roman" w:hAnsi="Times New Roman"/>
+          <w:sz w:val="26"/>
+          <w:szCs w:val="26"/>
+        </w:rPr>
+      </w:pPr>
+      <w:r>
+        <w:rPr>
+          <w:rFonts w:ascii="Times New Roman" w:cs="Times New Roman" w:eastAsia="Times New Roman" w:hAnsi="Times New Roman"/>
+          <w:sz w:val="26"/>
+          <w:szCs w:val="26"/>
+          <w:rtl w:val="0"/>
+        </w:rPr>
+        <w:t xml:space="preserve">ES: One…</w:t>
+      </w:r>
+    </w:p>
+    <w:p>
+      <w:pPr>
+        <w:rPr>
+          <w:rFonts w:ascii="Times New Roman" w:cs="Times New Roman" w:eastAsia="Times New Roman" w:hAnsi="Times New Roman"/>
+          <w:sz w:val="26"/>
+          <w:szCs w:val="26"/>
+        </w:rPr>
+      </w:pPr>
+      <w:r>
+        <w:rPr>
+          <w:rFonts w:ascii="Times New Roman" w:cs="Times New Roman" w:eastAsia="Times New Roman" w:hAnsi="Times New Roman"/>
+          <w:sz w:val="26"/>
+          <w:szCs w:val="26"/>
+          <w:rtl w:val="0"/>
+        </w:rPr>
+        <w:t xml:space="preserve">VOICE: Croak.</w:t>
+      </w:r>
+    </w:p>
+    <w:p>
+      <w:pPr>
+        <w:rPr>
+          <w:rFonts w:ascii="Times New Roman" w:cs="Times New Roman" w:eastAsia="Times New Roman" w:hAnsi="Times New Roman"/>
+          <w:sz w:val="26"/>
+          <w:szCs w:val="26"/>
+        </w:rPr>
+      </w:pPr>
+      <w:r>
+        <w:rPr>
+          <w:rFonts w:ascii="Times New Roman" w:cs="Times New Roman" w:eastAsia="Times New Roman" w:hAnsi="Times New Roman"/>
+          <w:sz w:val="26"/>
+          <w:szCs w:val="26"/>
+          <w:rtl w:val="0"/>
+        </w:rPr>
+        <w:t xml:space="preserve">IMAGE: </w:t>
+      </w:r>
+    </w:p>
+    <w:p>
+      <w:pPr>
+        <w:rPr>
+          <w:rFonts w:ascii="Times New Roman" w:cs="Times New Roman" w:eastAsia="Times New Roman" w:hAnsi="Times New Roman"/>
+          <w:sz w:val="26"/>
+          <w:szCs w:val="26"/>
+        </w:rPr>
+      </w:pPr>
+      <w:r>
+        <w:rPr>
+          <w:rFonts w:ascii="Times New Roman" w:cs="Times New Roman" w:eastAsia="Times New Roman" w:hAnsi="Times New Roman"/>
+          <w:sz w:val="26"/>
+          <w:szCs w:val="26"/>
+          <w:rtl w:val="0"/>
+        </w:rPr>
+        <w:t xml:space="preserve">NARRATOR: But despite that, her body feels like it’s been submerged in an ice bath.</w:t>
+      </w:r>
+    </w:p>
+    <w:p>
+      <w:pPr>
+        <w:rPr>
+          <w:rFonts w:ascii="Times New Roman" w:cs="Times New Roman" w:eastAsia="Times New Roman" w:hAnsi="Times New Roman"/>
+          <w:sz w:val="26"/>
+          <w:szCs w:val="26"/>
+        </w:rPr>
+      </w:pPr>
+      <w:r>
+        <w:rPr>
+          <w:rFonts w:ascii="Times New Roman" w:cs="Times New Roman" w:eastAsia="Times New Roman" w:hAnsi="Times New Roman"/>
+          <w:sz w:val="26"/>
+          <w:szCs w:val="26"/>
+          <w:rtl w:val="0"/>
+        </w:rPr>
+        <w:t xml:space="preserve">NARRATOR: Her tongue presses against the roof of her mouth.</w:t>
+      </w:r>
+    </w:p>
+    <w:p>
+      <w:pPr>
+        <w:rPr>
+          <w:rFonts w:ascii="Times New Roman" w:cs="Times New Roman" w:eastAsia="Times New Roman" w:hAnsi="Times New Roman"/>
+          <w:sz w:val="26"/>
+          <w:szCs w:val="26"/>
+        </w:rPr>
+      </w:pPr>
+      <w:r>
+        <w:rPr>
+          <w:rFonts w:ascii="Times New Roman" w:cs="Times New Roman" w:eastAsia="Times New Roman" w:hAnsi="Times New Roman"/>
+          <w:sz w:val="26"/>
+          <w:szCs w:val="26"/>
+          <w:rtl w:val="0"/>
+        </w:rPr>
+        <w:t xml:space="preserve">ES: Two…</w:t>
+      </w:r>
+    </w:p>
+    <w:p>
+      <w:pPr>
+        <w:rPr>
+          <w:rFonts w:ascii="Times New Roman" w:cs="Times New Roman" w:eastAsia="Times New Roman" w:hAnsi="Times New Roman"/>
+          <w:sz w:val="26"/>
+          <w:szCs w:val="26"/>
+        </w:rPr>
+      </w:pPr>
+      <w:r>
+        <w:rPr>
+          <w:rFonts w:ascii="Times New Roman" w:cs="Times New Roman" w:eastAsia="Times New Roman" w:hAnsi="Times New Roman"/>
+          <w:sz w:val="26"/>
+          <w:szCs w:val="26"/>
+          <w:rtl w:val="0"/>
+        </w:rPr>
+        <w:t xml:space="preserve">NARRATOR: She can hear crunching up there, just outside the door.</w:t>
+      </w:r>
+    </w:p>
+    <w:p>
+      <w:pPr>
+        <w:rPr>
+          <w:rFonts w:ascii="Times New Roman" w:cs="Times New Roman" w:eastAsia="Times New Roman" w:hAnsi="Times New Roman"/>
+          <w:sz w:val="26"/>
+          <w:szCs w:val="26"/>
+        </w:rPr>
+      </w:pPr>
+      <w:r>
+        <w:rPr>
+          <w:rFonts w:ascii="Times New Roman" w:cs="Times New Roman" w:eastAsia="Times New Roman" w:hAnsi="Times New Roman"/>
+          <w:sz w:val="26"/>
+          <w:szCs w:val="26"/>
+          <w:rtl w:val="0"/>
+        </w:rPr>
+        <w:t xml:space="preserve">VOICE: "The sun has eaten us."</w:t>
+      </w:r>
+    </w:p>
+    <w:p>
+      <w:pPr>
+        <w:rPr>
+          <w:rFonts w:ascii="Times New Roman" w:cs="Times New Roman" w:eastAsia="Times New Roman" w:hAnsi="Times New Roman"/>
+          <w:sz w:val="26"/>
+          <w:szCs w:val="26"/>
+        </w:rPr>
+      </w:pPr>
+      <w:r>
+        <w:rPr>
+          <w:rFonts w:ascii="Times New Roman" w:cs="Times New Roman" w:eastAsia="Times New Roman" w:hAnsi="Times New Roman"/>
+          <w:sz w:val="26"/>
+          <w:szCs w:val="26"/>
+          <w:rtl w:val="0"/>
+        </w:rPr>
+        <w:t xml:space="preserve">ES: ..?</w:t>
+      </w:r>
+    </w:p>
+    <w:p>
+      <w:pPr>
+        <w:rPr>
+          <w:rFonts w:ascii="Times New Roman" w:cs="Times New Roman" w:eastAsia="Times New Roman" w:hAnsi="Times New Roman"/>
+          <w:sz w:val="26"/>
+          <w:szCs w:val="26"/>
+        </w:rPr>
+      </w:pPr>
+      <w:r>
+        <w:rPr>
+          <w:rFonts w:ascii="Times New Roman" w:cs="Times New Roman" w:eastAsia="Times New Roman" w:hAnsi="Times New Roman"/>
+          <w:sz w:val="26"/>
+          <w:szCs w:val="26"/>
+          <w:rtl w:val="0"/>
+        </w:rPr>
+        <w:t xml:space="preserve">NARRATOR: Es is taken aback. She blunders on the count and hones in on the lightbulb string swaying on the ceiling.</w:t>
+      </w:r>
+    </w:p>
+    <w:p>
+      <w:pPr>
+        <w:rPr>
+          <w:rFonts w:ascii="Times New Roman" w:cs="Times New Roman" w:eastAsia="Times New Roman" w:hAnsi="Times New Roman"/>
+          <w:sz w:val="26"/>
+          <w:szCs w:val="26"/>
+        </w:rPr>
+      </w:pPr>
+      <w:r>
+        <w:rPr>
+          <w:rFonts w:ascii="Times New Roman" w:cs="Times New Roman" w:eastAsia="Times New Roman" w:hAnsi="Times New Roman"/>
+          <w:sz w:val="26"/>
+          <w:szCs w:val="26"/>
+          <w:rtl w:val="0"/>
+        </w:rPr>
+        <w:t xml:space="preserve">NARRATOR: "The sun has eaten us."</w:t>
+      </w:r>
+    </w:p>
+    <w:p>
+      <w:pPr>
+        <w:rPr>
+          <w:rFonts w:ascii="Times New Roman" w:cs="Times New Roman" w:eastAsia="Times New Roman" w:hAnsi="Times New Roman"/>
+          <w:sz w:val="26"/>
+          <w:szCs w:val="26"/>
+        </w:rPr>
+      </w:pPr>
+      <w:r>
+        <w:rPr>
+          <w:rFonts w:ascii="Times New Roman" w:cs="Times New Roman" w:eastAsia="Times New Roman" w:hAnsi="Times New Roman"/>
+          <w:sz w:val="26"/>
+          <w:szCs w:val="26"/>
+          <w:rtl w:val="0"/>
+        </w:rPr>
+        <w:t xml:space="preserve">NARRATOR: The voice continues:</w:t>
+      </w:r>
+    </w:p>
+    <w:p>
+      <w:pPr>
+        <w:rPr>
+          <w:rFonts w:ascii="Times New Roman" w:cs="Times New Roman" w:eastAsia="Times New Roman" w:hAnsi="Times New Roman"/>
+          <w:sz w:val="26"/>
+          <w:szCs w:val="26"/>
+        </w:rPr>
+      </w:pPr>
+      <w:r>
+        <w:rPr>
+          <w:rFonts w:ascii="Times New Roman" w:cs="Times New Roman" w:eastAsia="Times New Roman" w:hAnsi="Times New Roman"/>
+          <w:sz w:val="26"/>
+          <w:szCs w:val="26"/>
+          <w:rtl w:val="0"/>
+        </w:rPr>
+        <w:t xml:space="preserve">VOICE: "The only way out is to kill it from the inside."</w:t>
       </w:r>
     </w:p>
     <w:p>
@@ -1073,212 +2231,188 @@
           <w:szCs w:val="26"/>
           <w:rtl w:val="0"/>
         </w:rPr>
-        <w:t xml:space="preserve">START: Meadow</w:t>
-      </w:r>
-    </w:p>
-    <w:p>
-      <w:pPr>
-        <w:rPr>
-          <w:rFonts w:ascii="Times New Roman" w:cs="Times New Roman" w:eastAsia="Times New Roman" w:hAnsi="Times New Roman"/>
-          <w:sz w:val="26"/>
-          <w:szCs w:val="26"/>
-        </w:rPr>
-      </w:pPr>
-      <w:r>
-        <w:rPr>
-          <w:rtl w:val="0"/>
-        </w:rPr>
-      </w:r>
-    </w:p>
-    <w:p>
-      <w:pPr>
-        <w:rPr>
-          <w:rFonts w:ascii="Times New Roman" w:cs="Times New Roman" w:eastAsia="Times New Roman" w:hAnsi="Times New Roman"/>
-          <w:sz w:val="26"/>
-          <w:szCs w:val="26"/>
-        </w:rPr>
-      </w:pPr>
-      <w:r>
-        <w:rPr>
-          <w:rFonts w:ascii="Times New Roman" w:cs="Times New Roman" w:eastAsia="Times New Roman" w:hAnsi="Times New Roman"/>
-          <w:sz w:val="26"/>
-          <w:szCs w:val="26"/>
-          <w:rtl w:val="0"/>
-        </w:rPr>
-        <w:t xml:space="preserve">NODE: Meadow</w:t>
-      </w:r>
-    </w:p>
-    <w:p>
-      <w:pPr>
-        <w:rPr>
-          <w:rFonts w:ascii="Times New Roman" w:cs="Times New Roman" w:eastAsia="Times New Roman" w:hAnsi="Times New Roman"/>
-          <w:sz w:val="26"/>
-          <w:szCs w:val="26"/>
-        </w:rPr>
-      </w:pPr>
-      <w:r>
-        <w:rPr>
-          <w:rFonts w:ascii="Times New Roman" w:cs="Times New Roman" w:eastAsia="Times New Roman" w:hAnsi="Times New Roman"/>
-          <w:sz w:val="26"/>
-          <w:szCs w:val="26"/>
-          <w:rtl w:val="0"/>
-        </w:rPr>
-        <w:t xml:space="preserve">NARRATOR: The voice called again:</w:t>
-      </w:r>
-    </w:p>
-    <w:p>
-      <w:pPr>
-        <w:rPr>
-          <w:rFonts w:ascii="Times New Roman" w:cs="Times New Roman" w:eastAsia="Times New Roman" w:hAnsi="Times New Roman"/>
-          <w:sz w:val="26"/>
-          <w:szCs w:val="26"/>
-        </w:rPr>
-      </w:pPr>
-      <w:r>
-        <w:rPr>
-          <w:rFonts w:ascii="Times New Roman" w:cs="Times New Roman" w:eastAsia="Times New Roman" w:hAnsi="Times New Roman"/>
-          <w:sz w:val="26"/>
-          <w:szCs w:val="26"/>
-          <w:rtl w:val="0"/>
-        </w:rPr>
-        <w:t xml:space="preserve">VOICE: "The sun…"</w:t>
-      </w:r>
-    </w:p>
-    <w:p>
-      <w:pPr>
-        <w:rPr>
-          <w:rFonts w:ascii="Times New Roman" w:cs="Times New Roman" w:eastAsia="Times New Roman" w:hAnsi="Times New Roman"/>
-          <w:sz w:val="26"/>
-          <w:szCs w:val="26"/>
-        </w:rPr>
-      </w:pPr>
-      <w:r>
-        <w:rPr>
-          <w:rFonts w:ascii="Times New Roman" w:cs="Times New Roman" w:eastAsia="Times New Roman" w:hAnsi="Times New Roman"/>
-          <w:sz w:val="26"/>
-          <w:szCs w:val="26"/>
-          <w:rtl w:val="0"/>
-        </w:rPr>
-        <w:t xml:space="preserve">IMAGE: dist/images/Sun.png</w:t>
-      </w:r>
-    </w:p>
-    <w:p>
-      <w:pPr>
-        <w:rPr>
-          <w:rFonts w:ascii="Times New Roman" w:cs="Times New Roman" w:eastAsia="Times New Roman" w:hAnsi="Times New Roman"/>
-          <w:sz w:val="26"/>
-          <w:szCs w:val="26"/>
-        </w:rPr>
-      </w:pPr>
-      <w:r>
-        <w:rPr>
-          <w:rFonts w:ascii="Times New Roman" w:cs="Times New Roman" w:eastAsia="Times New Roman" w:hAnsi="Times New Roman"/>
-          <w:sz w:val="26"/>
-          <w:szCs w:val="26"/>
-          <w:rtl w:val="0"/>
-        </w:rPr>
-        <w:t xml:space="preserve">NARRATOR: It trails off. Es doesn't understand.</w:t>
-      </w:r>
-    </w:p>
-    <w:p>
-      <w:pPr>
-        <w:rPr>
-          <w:rFonts w:ascii="Times New Roman" w:cs="Times New Roman" w:eastAsia="Times New Roman" w:hAnsi="Times New Roman"/>
-          <w:sz w:val="26"/>
-          <w:szCs w:val="26"/>
-        </w:rPr>
-      </w:pPr>
-      <w:r>
-        <w:rPr>
-          <w:rFonts w:ascii="Times New Roman" w:cs="Times New Roman" w:eastAsia="Times New Roman" w:hAnsi="Times New Roman"/>
-          <w:sz w:val="26"/>
-          <w:szCs w:val="26"/>
-          <w:rtl w:val="0"/>
-        </w:rPr>
-        <w:t xml:space="preserve">NARRATOR: Her back grazes against the wall as she rises to her feet, centimeter by centimeter, the lightbulb inhibiting her site any further into the basement.</w:t>
-      </w:r>
-    </w:p>
-    <w:p>
-      <w:pPr>
-        <w:rPr>
-          <w:rFonts w:ascii="Times New Roman" w:cs="Times New Roman" w:eastAsia="Times New Roman" w:hAnsi="Times New Roman"/>
-          <w:sz w:val="26"/>
-          <w:szCs w:val="26"/>
-        </w:rPr>
-      </w:pPr>
-      <w:r>
-        <w:rPr>
-          <w:rFonts w:ascii="Times New Roman" w:cs="Times New Roman" w:eastAsia="Times New Roman" w:hAnsi="Times New Roman"/>
-          <w:sz w:val="26"/>
-          <w:szCs w:val="26"/>
-          <w:rtl w:val="0"/>
-        </w:rPr>
-        <w:t xml:space="preserve">NARRATOR: Something's moving in there.</w:t>
-      </w:r>
-    </w:p>
-    <w:p>
-      <w:pPr>
-        <w:rPr>
-          <w:rFonts w:ascii="Times New Roman" w:cs="Times New Roman" w:eastAsia="Times New Roman" w:hAnsi="Times New Roman"/>
-          <w:sz w:val="26"/>
-          <w:szCs w:val="26"/>
-        </w:rPr>
-      </w:pPr>
-      <w:r>
-        <w:rPr>
-          <w:rFonts w:ascii="Times New Roman" w:cs="Times New Roman" w:eastAsia="Times New Roman" w:hAnsi="Times New Roman"/>
-          <w:sz w:val="26"/>
-          <w:szCs w:val="26"/>
-          <w:rtl w:val="0"/>
-        </w:rPr>
-        <w:t xml:space="preserve">VOICE: "The sun has eaten us."</w:t>
-      </w:r>
-    </w:p>
-    <w:p>
-      <w:pPr>
-        <w:rPr>
-          <w:rFonts w:ascii="Times New Roman" w:cs="Times New Roman" w:eastAsia="Times New Roman" w:hAnsi="Times New Roman"/>
-          <w:sz w:val="26"/>
-          <w:szCs w:val="26"/>
-        </w:rPr>
-      </w:pPr>
-      <w:r>
-        <w:rPr>
-          <w:rFonts w:ascii="Times New Roman" w:cs="Times New Roman" w:eastAsia="Times New Roman" w:hAnsi="Times New Roman"/>
-          <w:sz w:val="26"/>
-          <w:szCs w:val="26"/>
-          <w:rtl w:val="0"/>
-        </w:rPr>
-        <w:t xml:space="preserve">NARRATOR: The voice croaks.</w:t>
-      </w:r>
-    </w:p>
-    <w:p>
-      <w:pPr>
-        <w:rPr>
-          <w:rFonts w:ascii="Times New Roman" w:cs="Times New Roman" w:eastAsia="Times New Roman" w:hAnsi="Times New Roman"/>
-          <w:sz w:val="26"/>
-          <w:szCs w:val="26"/>
-        </w:rPr>
-      </w:pPr>
-      <w:r>
-        <w:rPr>
-          <w:rFonts w:ascii="Times New Roman" w:cs="Times New Roman" w:eastAsia="Times New Roman" w:hAnsi="Times New Roman"/>
-          <w:sz w:val="26"/>
-          <w:szCs w:val="26"/>
-          <w:rtl w:val="0"/>
-        </w:rPr>
-        <w:t xml:space="preserve">VOICE: "The only way out is to kill it from the inside."</w:t>
-      </w:r>
-      <w:r>
-        <w:rPr>
-          <w:rtl w:val="0"/>
-        </w:rPr>
-      </w:r>
-    </w:p>
-    <w:p>
-      <w:pPr>
-        <w:rPr>
-          <w:rFonts w:ascii="Times New Roman" w:cs="Times New Roman" w:eastAsia="Times New Roman" w:hAnsi="Times New Roman"/>
+        <w:t xml:space="preserve">START: Meadow_Router</w:t>
+      </w:r>
+    </w:p>
+    <w:p>
+      <w:pPr>
+        <w:rPr>
+          <w:rFonts w:ascii="Times New Roman" w:cs="Times New Roman" w:eastAsia="Times New Roman" w:hAnsi="Times New Roman"/>
+          <w:sz w:val="26"/>
+          <w:szCs w:val="26"/>
+        </w:rPr>
+      </w:pPr>
+      <w:r>
+        <w:rPr>
+          <w:rtl w:val="0"/>
+        </w:rPr>
+      </w:r>
+    </w:p>
+    <w:p>
+      <w:pPr>
+        <w:rPr>
+          <w:rFonts w:ascii="Times New Roman" w:cs="Times New Roman" w:eastAsia="Times New Roman" w:hAnsi="Times New Roman"/>
+          <w:sz w:val="26"/>
+          <w:szCs w:val="26"/>
+        </w:rPr>
+      </w:pPr>
+      <w:r>
+        <w:rPr>
+          <w:rFonts w:ascii="Times New Roman" w:cs="Times New Roman" w:eastAsia="Times New Roman" w:hAnsi="Times New Roman"/>
+          <w:sz w:val="26"/>
+          <w:szCs w:val="26"/>
+          <w:rtl w:val="0"/>
+        </w:rPr>
+        <w:t xml:space="preserve">NODE: Meadow_Router</w:t>
+      </w:r>
+    </w:p>
+    <w:p>
+      <w:pPr>
+        <w:rPr>
+          <w:rFonts w:ascii="Times New Roman" w:cs="Times New Roman" w:eastAsia="Times New Roman" w:hAnsi="Times New Roman"/>
+          <w:sz w:val="26"/>
+          <w:szCs w:val="26"/>
+        </w:rPr>
+      </w:pPr>
+      <w:r>
+        <w:rPr>
+          <w:rFonts w:ascii="Times New Roman" w:cs="Times New Roman" w:eastAsia="Times New Roman" w:hAnsi="Times New Roman"/>
+          <w:sz w:val="26"/>
+          <w:szCs w:val="26"/>
+          <w:rtl w:val="0"/>
+        </w:rPr>
+        <w:t xml:space="preserve">BRANCH_IF_FLAG: Aware_Of_Sun -&gt; Meadow_Aware_Of_Sun</w:t>
+      </w:r>
+    </w:p>
+    <w:p>
+      <w:pPr>
+        <w:rPr>
+          <w:rFonts w:ascii="Times New Roman" w:cs="Times New Roman" w:eastAsia="Times New Roman" w:hAnsi="Times New Roman"/>
+          <w:sz w:val="26"/>
+          <w:szCs w:val="26"/>
+        </w:rPr>
+      </w:pPr>
+      <w:r>
+        <w:rPr>
+          <w:rFonts w:ascii="Times New Roman" w:cs="Times New Roman" w:eastAsia="Times New Roman" w:hAnsi="Times New Roman"/>
+          <w:sz w:val="26"/>
+          <w:szCs w:val="26"/>
+          <w:rtl w:val="0"/>
+        </w:rPr>
+        <w:t xml:space="preserve">BRANCH_ELSE: Meadow_Unaware_Of_Sun</w:t>
+      </w:r>
+    </w:p>
+    <w:p>
+      <w:pPr>
+        <w:rPr>
+          <w:rFonts w:ascii="Times New Roman" w:cs="Times New Roman" w:eastAsia="Times New Roman" w:hAnsi="Times New Roman"/>
+          <w:sz w:val="26"/>
+          <w:szCs w:val="26"/>
+        </w:rPr>
+      </w:pPr>
+      <w:r>
+        <w:rPr>
+          <w:rtl w:val="0"/>
+        </w:rPr>
+      </w:r>
+    </w:p>
+    <w:p>
+      <w:pPr>
+        <w:rPr>
+          <w:rFonts w:ascii="Times New Roman" w:cs="Times New Roman" w:eastAsia="Times New Roman" w:hAnsi="Times New Roman"/>
+          <w:sz w:val="26"/>
+          <w:szCs w:val="26"/>
+        </w:rPr>
+      </w:pPr>
+      <w:r>
+        <w:rPr>
+          <w:rFonts w:ascii="Times New Roman" w:cs="Times New Roman" w:eastAsia="Times New Roman" w:hAnsi="Times New Roman"/>
+          <w:sz w:val="26"/>
+          <w:szCs w:val="26"/>
+          <w:rtl w:val="0"/>
+        </w:rPr>
+        <w:t xml:space="preserve">NODE: Meadow_Unaware_Of_Sun</w:t>
+      </w:r>
+    </w:p>
+    <w:p>
+      <w:pPr>
+        <w:rPr>
+          <w:rFonts w:ascii="Times New Roman" w:cs="Times New Roman" w:eastAsia="Times New Roman" w:hAnsi="Times New Roman"/>
+          <w:sz w:val="26"/>
+          <w:szCs w:val="26"/>
+        </w:rPr>
+      </w:pPr>
+      <w:r>
+        <w:rPr>
+          <w:rFonts w:ascii="Times New Roman" w:cs="Times New Roman" w:eastAsia="Times New Roman" w:hAnsi="Times New Roman"/>
+          <w:sz w:val="26"/>
+          <w:szCs w:val="26"/>
+          <w:rtl w:val="0"/>
+        </w:rPr>
+        <w:t xml:space="preserve">NARRATOR: [END OF DEMO CONTENT]</w:t>
+      </w:r>
+    </w:p>
+    <w:p>
+      <w:pPr>
+        <w:rPr>
+          <w:rFonts w:ascii="Times New Roman" w:cs="Times New Roman" w:eastAsia="Times New Roman" w:hAnsi="Times New Roman"/>
+          <w:sz w:val="26"/>
+          <w:szCs w:val="26"/>
+        </w:rPr>
+      </w:pPr>
+      <w:r>
+        <w:rPr>
+          <w:rtl w:val="0"/>
+        </w:rPr>
+      </w:r>
+    </w:p>
+    <w:p>
+      <w:pPr>
+        <w:rPr>
+          <w:rFonts w:ascii="Times New Roman" w:cs="Times New Roman" w:eastAsia="Times New Roman" w:hAnsi="Times New Roman"/>
+          <w:sz w:val="26"/>
+          <w:szCs w:val="26"/>
+        </w:rPr>
+      </w:pPr>
+      <w:r>
+        <w:rPr>
+          <w:rFonts w:ascii="Times New Roman" w:cs="Times New Roman" w:eastAsia="Times New Roman" w:hAnsi="Times New Roman"/>
+          <w:sz w:val="26"/>
+          <w:szCs w:val="26"/>
+          <w:rtl w:val="0"/>
+        </w:rPr>
+        <w:t xml:space="preserve">NODE: Meadow_Aware_Of_Sun</w:t>
+      </w:r>
+    </w:p>
+    <w:p>
+      <w:pPr>
+        <w:rPr>
+          <w:rFonts w:ascii="Times New Roman" w:cs="Times New Roman" w:eastAsia="Times New Roman" w:hAnsi="Times New Roman"/>
+          <w:sz w:val="26"/>
+          <w:szCs w:val="26"/>
+        </w:rPr>
+      </w:pPr>
+      <w:r>
+        <w:rPr>
+          <w:rFonts w:ascii="Times New Roman" w:cs="Times New Roman" w:eastAsia="Times New Roman" w:hAnsi="Times New Roman"/>
+          <w:sz w:val="26"/>
+          <w:szCs w:val="26"/>
+          <w:rtl w:val="0"/>
+        </w:rPr>
+        <w:t xml:space="preserve">NARRATOR: [END OF DEMO CONTENT]</w:t>
+      </w:r>
+      <w:r>
+        <w:rPr>
+          <w:rtl w:val="0"/>
+        </w:rPr>
+      </w:r>
+    </w:p>
+    <w:p>
+      <w:pPr>
+        <w:rPr>
+          <w:rFonts w:ascii="Times New Roman" w:cs="Times New Roman" w:eastAsia="Times New Roman" w:hAnsi="Times New Roman"/>
+          <w:sz w:val="26"/>
+          <w:szCs w:val="26"/>
         </w:rPr>
       </w:pPr>
       <w:r>

</xml_diff>